<commit_message>
Update with review changes
</commit_message>
<xml_diff>
--- a/specification_document/mzML_1.1.0_UseCaseRecommendationForDIAandIMSdata_v1.0.docx
+++ b/specification_document/mzML_1.1.0_UseCaseRecommendationForDIAandIMSdata_v1.0.docx
@@ -329,7 +329,7 @@
       <w:r>
         <w:t xml:space="preserve"> 1.1. It was consensus that the data could be encoded with only the addition of controlled vocabulary terms </w:t>
       </w:r>
-      <w:hyperlink r:id="rId7">
+      <w:hyperlink r:id="rId8">
         <w:r>
           <w:rPr>
             <w:color w:val="000000"/>
@@ -660,7 +660,19 @@
                 <w:color w:val="000000"/>
               </w:rPr>
               <w:tab/>
-              <w:t>The documentation</w:t>
+              <w:t>The docume</w:t>
+            </w:r>
+            <w:r>
+              <w:rPr>
+                <w:color w:val="000000"/>
+              </w:rPr>
+              <w:t>n</w:t>
+            </w:r>
+            <w:r>
+              <w:rPr>
+                <w:color w:val="000000"/>
+              </w:rPr>
+              <w:t>tation</w:t>
             </w:r>
             <w:r>
               <w:rPr>
@@ -1266,11 +1278,6 @@
     <w:p>
       <w:pPr>
         <w:pStyle w:val="Heading2"/>
-        <w:numPr>
-          <w:ilvl w:val="1"/>
-          <w:numId w:val="2"/>
-        </w:numPr>
-        <w:jc w:val="both"/>
       </w:pPr>
       <w:bookmarkStart w:id="1" w:name="_30j0zll" w:colFirst="0" w:colLast="0"/>
       <w:bookmarkEnd w:id="1"/>
@@ -1300,7 +1307,7 @@
       <w:r>
         <w:t xml:space="preserve"> format </w:t>
       </w:r>
-      <w:hyperlink r:id="rId8">
+      <w:hyperlink r:id="rId9">
         <w:r>
           <w:rPr>
             <w:color w:val="000000"/>
@@ -1371,7 +1378,7 @@
       <w:r>
         <w:t xml:space="preserve">Recently developed workflows by different instrument vendors include Waters Corporation SONAR (scanning quadrupole data independent acquisition) </w:t>
       </w:r>
-      <w:hyperlink r:id="rId9">
+      <w:hyperlink r:id="rId10">
         <w:r>
           <w:rPr>
             <w:color w:val="000000"/>
@@ -1382,7 +1389,7 @@
       <w:r>
         <w:t xml:space="preserve"> and HDMSE (ion mobility assisted data independent acquisition) </w:t>
       </w:r>
-      <w:hyperlink r:id="rId10">
+      <w:hyperlink r:id="rId11">
         <w:r>
           <w:rPr>
             <w:color w:val="000000"/>
@@ -1409,7 +1416,7 @@
       <w:r>
         <w:t xml:space="preserve"> </w:t>
       </w:r>
-      <w:hyperlink r:id="rId11">
+      <w:hyperlink r:id="rId12">
         <w:r>
           <w:rPr>
             <w:color w:val="000000"/>
@@ -1452,7 +1459,7 @@
       <w:r>
         <w:t xml:space="preserve"> </w:t>
       </w:r>
-      <w:hyperlink r:id="rId12">
+      <w:hyperlink r:id="rId13">
         <w:r>
           <w:rPr>
             <w:color w:val="000000"/>
@@ -1486,11 +1493,6 @@
     <w:p>
       <w:pPr>
         <w:pStyle w:val="Heading2"/>
-        <w:numPr>
-          <w:ilvl w:val="1"/>
-          <w:numId w:val="2"/>
-        </w:numPr>
-        <w:jc w:val="both"/>
       </w:pPr>
       <w:bookmarkStart w:id="4" w:name="_2et92p0" w:colFirst="0" w:colLast="0"/>
       <w:bookmarkEnd w:id="4"/>
@@ -1658,11 +1660,6 @@
     <w:p>
       <w:pPr>
         <w:pStyle w:val="Heading2"/>
-        <w:numPr>
-          <w:ilvl w:val="1"/>
-          <w:numId w:val="2"/>
-        </w:numPr>
-        <w:jc w:val="both"/>
       </w:pPr>
       <w:bookmarkStart w:id="5" w:name="_tyjcwt" w:colFirst="0" w:colLast="0"/>
       <w:bookmarkEnd w:id="5"/>
@@ -1743,7 +1740,7 @@
       <w:r>
         <w:t xml:space="preserve">The key words “MUST“, “MUST NOT”, “REQUIRED”, “SHALL”, “SHALL NOT”, “SHOULD”, “SHOULD NOT”, “RECOMMENDED”, “MAY”, and “OPTIONAL” are to be interpreted as described in RFC 2119 </w:t>
       </w:r>
-      <w:hyperlink r:id="rId13">
+      <w:hyperlink r:id="rId14">
         <w:r>
           <w:rPr>
             <w:color w:val="000000"/>
@@ -1806,11 +1803,6 @@
     <w:p>
       <w:pPr>
         <w:pStyle w:val="Heading2"/>
-        <w:numPr>
-          <w:ilvl w:val="1"/>
-          <w:numId w:val="2"/>
-        </w:numPr>
-        <w:jc w:val="both"/>
       </w:pPr>
       <w:bookmarkStart w:id="11" w:name="_3rdcrjn" w:colFirst="0" w:colLast="0"/>
       <w:bookmarkEnd w:id="11"/>
@@ -1841,68 +1833,6 @@
       <w:proofErr w:type="spellEnd"/>
       <w:r>
         <w:t xml:space="preserve"> documentation page at the HUPO-PSI website (</w:t>
-      </w:r>
-      <w:hyperlink r:id="rId14">
-        <w:r>
-          <w:rPr>
-            <w:color w:val="0000FF"/>
-            <w:u w:val="single"/>
-          </w:rPr>
-          <w:t>http://www.psidev.info/mzML</w:t>
-        </w:r>
-      </w:hyperlink>
-      <w:r>
-        <w:t>).</w:t>
-      </w:r>
-    </w:p>
-    <w:p>
-      <w:pPr>
-        <w:jc w:val="both"/>
-      </w:pPr>
-    </w:p>
-    <w:p>
-      <w:pPr>
-        <w:keepNext/>
-        <w:jc w:val="both"/>
-        <w:rPr>
-          <w:color w:val="000000"/>
-        </w:rPr>
-      </w:pPr>
-    </w:p>
-    <w:p>
-      <w:pPr>
-        <w:pStyle w:val="Heading2"/>
-        <w:numPr>
-          <w:ilvl w:val="1"/>
-          <w:numId w:val="2"/>
-        </w:numPr>
-        <w:jc w:val="both"/>
-      </w:pPr>
-      <w:bookmarkStart w:id="12" w:name="_26in1rg" w:colFirst="0" w:colLast="0"/>
-      <w:bookmarkEnd w:id="12"/>
-      <w:r>
-        <w:t>Relationship to other specifications</w:t>
-      </w:r>
-    </w:p>
-    <w:p>
-      <w:pPr>
-        <w:jc w:val="both"/>
-      </w:pPr>
-    </w:p>
-    <w:p>
-      <w:pPr>
-        <w:jc w:val="both"/>
-      </w:pPr>
-      <w:r>
-        <w:t xml:space="preserve">This recommendation is a direct addendum to the main </w:t>
-      </w:r>
-      <w:proofErr w:type="spellStart"/>
-      <w:r>
-        <w:t>mzML</w:t>
-      </w:r>
-      <w:proofErr w:type="spellEnd"/>
-      <w:r>
-        <w:t xml:space="preserve"> 1.1 specification, which can be found at </w:t>
       </w:r>
       <w:hyperlink r:id="rId15">
         <w:r>
@@ -1914,6 +1844,63 @@
         </w:r>
       </w:hyperlink>
       <w:r>
+        <w:t>).</w:t>
+      </w:r>
+    </w:p>
+    <w:p>
+      <w:pPr>
+        <w:jc w:val="both"/>
+      </w:pPr>
+    </w:p>
+    <w:p>
+      <w:pPr>
+        <w:keepNext/>
+        <w:jc w:val="both"/>
+        <w:rPr>
+          <w:color w:val="000000"/>
+        </w:rPr>
+      </w:pPr>
+    </w:p>
+    <w:p>
+      <w:pPr>
+        <w:pStyle w:val="Heading2"/>
+      </w:pPr>
+      <w:bookmarkStart w:id="12" w:name="_26in1rg" w:colFirst="0" w:colLast="0"/>
+      <w:bookmarkEnd w:id="12"/>
+      <w:r>
+        <w:t>Relationship to other specifications</w:t>
+      </w:r>
+    </w:p>
+    <w:p>
+      <w:pPr>
+        <w:jc w:val="both"/>
+      </w:pPr>
+    </w:p>
+    <w:p>
+      <w:pPr>
+        <w:jc w:val="both"/>
+      </w:pPr>
+      <w:r>
+        <w:t xml:space="preserve">This recommendation is a direct addendum to the main </w:t>
+      </w:r>
+      <w:proofErr w:type="spellStart"/>
+      <w:r>
+        <w:t>mzML</w:t>
+      </w:r>
+      <w:proofErr w:type="spellEnd"/>
+      <w:r>
+        <w:t xml:space="preserve"> 1.1 specification, which can be found at </w:t>
+      </w:r>
+      <w:hyperlink r:id="rId16">
+        <w:r>
+          <w:rPr>
+            <w:color w:val="0000FF"/>
+            <w:u w:val="single"/>
+          </w:rPr>
+          <w:t>http://www.psidev.info/mzML</w:t>
+        </w:r>
+      </w:hyperlink>
+      <w:r>
         <w:t>.</w:t>
       </w:r>
     </w:p>
@@ -1930,16 +1917,11 @@
     <w:p>
       <w:pPr>
         <w:pStyle w:val="Heading2"/>
-        <w:numPr>
-          <w:ilvl w:val="1"/>
-          <w:numId w:val="2"/>
-        </w:numPr>
-        <w:jc w:val="both"/>
       </w:pPr>
       <w:bookmarkStart w:id="13" w:name="_lnxbz9" w:colFirst="0" w:colLast="0"/>
       <w:bookmarkEnd w:id="13"/>
       <w:r>
-        <w:t xml:space="preserve"> Adjustments for raw DIA data such as SONAR, HDMSE, or </w:t>
+        <w:t xml:space="preserve">Adjustments for raw DIA data such as SONAR, HDMSE, or </w:t>
       </w:r>
       <w:proofErr w:type="spellStart"/>
       <w:r>
@@ -1960,13 +1942,7 @@
         <w:jc w:val="both"/>
       </w:pPr>
       <w:r>
-        <w:t>When raw (i.e. not deconvol</w:t>
-      </w:r>
-      <w:r>
-        <w:t>ut</w:t>
-      </w:r>
-      <w:r>
-        <w:t xml:space="preserve">ed) data from SONAR, HDMSE, </w:t>
+        <w:t xml:space="preserve">When raw (i.e. not deconvoluted) data from SONAR, HDMSE, </w:t>
       </w:r>
       <w:proofErr w:type="spellStart"/>
       <w:r>
@@ -1982,10 +1958,7 @@
       </w:r>
       <w:proofErr w:type="spellEnd"/>
       <w:r>
-        <w:t>, the file content header SHOULD contain one or more of the following merged-concept CV terms</w:t>
-      </w:r>
-      <w:r>
-        <w:t xml:space="preserve"> (</w:t>
+        <w:t>, the file content header SHOULD contain one or more of the following merged-concept CV terms (</w:t>
       </w:r>
       <w:r>
         <w:rPr>
@@ -1995,13 +1968,7 @@
         <w:t>Table 1</w:t>
       </w:r>
       <w:r>
-        <w:t>)</w:t>
-      </w:r>
-      <w:r>
-        <w:t>, depending on the appropriate workflow. Individual constituent terms are also defined in the CV, but SHOULD NOT be used.</w:t>
-      </w:r>
-      <w:r>
-        <w:t xml:space="preserve"> Example datasets used as part of </w:t>
+        <w:t xml:space="preserve">), depending on the appropriate workflow. Individual constituent terms are also defined in the CV, but SHOULD NOT be used. Example datasets used as part of </w:t>
       </w:r>
       <w:proofErr w:type="spellStart"/>
       <w:r>
@@ -2679,9 +2646,6 @@
               <w:t>MS</w:t>
             </w:r>
             <w:r>
-              <w:rPr>
-                <w:vertAlign w:val="superscript"/>
-              </w:rPr>
               <w:t>E</w:t>
             </w:r>
           </w:p>
@@ -2726,10 +2690,7 @@
               <w:widowControl w:val="0"/>
             </w:pPr>
             <w:r>
-              <w:t>- data independent acquisition from dissociation of full mass range</w:t>
-            </w:r>
-            <w:r>
-              <w:t xml:space="preserve"> (MS:1003227)</w:t>
+              <w:t>- data independent acquisition from dissociation of full mass range (MS:1003227)</w:t>
             </w:r>
           </w:p>
         </w:tc>
@@ -2749,16 +2710,7 @@
               <w:widowControl w:val="0"/>
             </w:pPr>
             <w:r>
-              <w:t>- data</w:t>
-            </w:r>
-            <w:r>
-              <w:t>-</w:t>
-            </w:r>
-            <w:r>
-              <w:t>independent acquisition</w:t>
-            </w:r>
-            <w:r>
-              <w:t xml:space="preserve"> (MS:1003215)</w:t>
+              <w:t>- data-independent acquisition (MS:1003215)</w:t>
             </w:r>
           </w:p>
           <w:p>
@@ -2766,10 +2718,7 @@
               <w:widowControl w:val="0"/>
             </w:pPr>
             <w:r>
-              <w:t>- dissociation of full mass range</w:t>
-            </w:r>
-            <w:r>
-              <w:t xml:space="preserve"> (MS:1003216)</w:t>
+              <w:t>- dissociation of full mass range (MS:1003216)</w:t>
             </w:r>
           </w:p>
         </w:tc>
@@ -2812,10 +2761,7 @@
               <w:widowControl w:val="0"/>
             </w:pPr>
             <w:r>
-              <w:t>- data independent acquisition from dissociation of scanning quadrupole across mass range</w:t>
-            </w:r>
-            <w:r>
-              <w:t xml:space="preserve"> (MS:1003228)</w:t>
+              <w:t>- data independent acquisition from dissociation of scanning quadrupole across mass range (MS:1003228)</w:t>
             </w:r>
           </w:p>
         </w:tc>
@@ -2835,16 +2781,7 @@
               <w:widowControl w:val="0"/>
             </w:pPr>
             <w:r>
-              <w:t>- data</w:t>
-            </w:r>
-            <w:r>
-              <w:t>-</w:t>
-            </w:r>
-            <w:r>
-              <w:t>independent acquisition</w:t>
-            </w:r>
-            <w:r>
-              <w:t xml:space="preserve"> (MS:1003215)</w:t>
+              <w:t>- data-independent acquisition (MS:1003215)</w:t>
             </w:r>
           </w:p>
           <w:p>
@@ -2852,10 +2789,7 @@
               <w:widowControl w:val="0"/>
             </w:pPr>
             <w:r>
-              <w:t>- dissociation of scanning quadrupole across a specified mass range</w:t>
-            </w:r>
-            <w:r>
-              <w:t xml:space="preserve"> (MS:1003217)</w:t>
+              <w:t>- dissociation of scanning quadrupole across a specified mass range (MS:1003217)</w:t>
             </w:r>
           </w:p>
           <w:p>
@@ -2938,10 +2872,7 @@
               <w:widowControl w:val="0"/>
             </w:pPr>
             <w:r>
-              <w:t>- data independent acquisition from dissociation of sequential mass ranges</w:t>
-            </w:r>
-            <w:r>
-              <w:t xml:space="preserve"> (MS:1003224)</w:t>
+              <w:t>- data independent acquisition from dissociation of sequential mass ranges (MS:1003224)</w:t>
             </w:r>
           </w:p>
         </w:tc>
@@ -2961,16 +2892,7 @@
               <w:widowControl w:val="0"/>
             </w:pPr>
             <w:r>
-              <w:t>- data</w:t>
-            </w:r>
-            <w:r>
-              <w:t>-</w:t>
-            </w:r>
-            <w:r>
-              <w:t>independent acquisition</w:t>
-            </w:r>
-            <w:r>
-              <w:t xml:space="preserve"> (MS:1003215)</w:t>
+              <w:t>- data-independent acquisition (MS:1003215)</w:t>
             </w:r>
           </w:p>
           <w:p>
@@ -2978,10 +2900,7 @@
               <w:widowControl w:val="0"/>
             </w:pPr>
             <w:r>
-              <w:t>- dissociation of sequential mass ranges</w:t>
-            </w:r>
-            <w:r>
-              <w:t xml:space="preserve"> (MS:1003218)</w:t>
+              <w:t>- dissociation of sequential mass ranges (MS:1003218)</w:t>
             </w:r>
           </w:p>
         </w:tc>
@@ -3032,16 +2951,7 @@
               <w:widowControl w:val="0"/>
             </w:pPr>
             <w:r>
-              <w:t xml:space="preserve">- data independent acquisition from dissociation of sequential mass ranges </w:t>
-            </w:r>
-            <w:r>
-              <w:t xml:space="preserve">after </w:t>
-            </w:r>
-            <w:r>
-              <w:t>ion mobility</w:t>
-            </w:r>
-            <w:r>
-              <w:t xml:space="preserve"> separation (MS:1003225)</w:t>
+              <w:t>- data independent acquisition from dissociation of sequential mass ranges after ion mobility separation (MS:1003225)</w:t>
             </w:r>
           </w:p>
         </w:tc>
@@ -3061,16 +2971,7 @@
               <w:widowControl w:val="0"/>
             </w:pPr>
             <w:r>
-              <w:t>- data</w:t>
-            </w:r>
-            <w:r>
-              <w:t>-</w:t>
-            </w:r>
-            <w:r>
-              <w:t>independent acquisition</w:t>
-            </w:r>
-            <w:r>
-              <w:t xml:space="preserve"> (MS:1003215)</w:t>
+              <w:t>- data-independent acquisition (MS:1003215)</w:t>
             </w:r>
           </w:p>
           <w:p>
@@ -3078,10 +2979,7 @@
               <w:widowControl w:val="0"/>
             </w:pPr>
             <w:r>
-              <w:t>- dissociation of sequential mass ranges</w:t>
-            </w:r>
-            <w:r>
-              <w:t xml:space="preserve"> (MS:1003218)</w:t>
+              <w:t>- dissociation of sequential mass ranges (MS:1003218)</w:t>
             </w:r>
           </w:p>
           <w:p>
@@ -3115,9 +3013,6 @@
               <w:t>HDMS</w:t>
             </w:r>
             <w:r>
-              <w:rPr>
-                <w:vertAlign w:val="superscript"/>
-              </w:rPr>
               <w:t>E</w:t>
             </w:r>
           </w:p>
@@ -3147,16 +3042,7 @@
               <w:widowControl w:val="0"/>
             </w:pPr>
             <w:r>
-              <w:t xml:space="preserve">- data independent acquisition from dissociation of full mass range </w:t>
-            </w:r>
-            <w:r>
-              <w:t xml:space="preserve">after </w:t>
-            </w:r>
-            <w:r>
-              <w:t>ion mobility</w:t>
-            </w:r>
-            <w:r>
-              <w:t xml:space="preserve"> separation (MS:1003226)</w:t>
+              <w:t>- data independent acquisition from dissociation of full mass range after ion mobility separation (MS:1003226)</w:t>
             </w:r>
           </w:p>
         </w:tc>
@@ -3176,16 +3062,7 @@
               <w:widowControl w:val="0"/>
             </w:pPr>
             <w:r>
-              <w:t>- data</w:t>
-            </w:r>
-            <w:r>
-              <w:t>-</w:t>
-            </w:r>
-            <w:r>
-              <w:t>independent acquisition</w:t>
-            </w:r>
-            <w:r>
-              <w:t xml:space="preserve"> (MS:1003215)</w:t>
+              <w:t>- data-independent acquisition (MS:1003215)</w:t>
             </w:r>
           </w:p>
           <w:p>
@@ -3193,10 +3070,7 @@
               <w:widowControl w:val="0"/>
             </w:pPr>
             <w:r>
-              <w:t>- dissociation of full mass range</w:t>
-            </w:r>
-            <w:r>
-              <w:t xml:space="preserve"> (MS:1003216)</w:t>
+              <w:t>- dissociation of full mass range (MS:1003216)</w:t>
             </w:r>
           </w:p>
           <w:p>
@@ -3204,10 +3078,7 @@
               <w:widowControl w:val="0"/>
             </w:pPr>
             <w:r>
-              <w:t>- ion mobility separation</w:t>
-            </w:r>
-            <w:r>
-              <w:t xml:space="preserve"> (MS:1003219)</w:t>
+              <w:t>- ion mobility separation (MS:1003219)</w:t>
             </w:r>
           </w:p>
         </w:tc>
@@ -3233,27 +3104,13 @@
       <w:r>
         <w:t xml:space="preserve"> GitHub repository: </w:t>
       </w:r>
-      <w:hyperlink r:id="rId16">
+      <w:hyperlink r:id="rId17">
         <w:r>
           <w:rPr>
             <w:color w:val="1155CC"/>
             <w:u w:val="single"/>
           </w:rPr>
-          <w:t>https://github.com/HUPO-PSI/mzML/tree/master/specification_document/dia_workflow_c</w:t>
-        </w:r>
-        <w:r>
-          <w:rPr>
-            <w:color w:val="1155CC"/>
-            <w:u w:val="single"/>
-          </w:rPr>
-          <w:t>v</w:t>
-        </w:r>
-        <w:r>
-          <w:rPr>
-            <w:color w:val="1155CC"/>
-            <w:u w:val="single"/>
-          </w:rPr>
-          <w:t>.md</w:t>
+          <w:t>https://github.com/HUPO-PSI/mzML/tree/master/specification_document/dia_workflow_cv.md</w:t>
         </w:r>
       </w:hyperlink>
       <w:r>
@@ -3299,25 +3156,7 @@
         <w:jc w:val="both"/>
       </w:pPr>
       <w:r>
-        <w:t>However, for ion mobility data, instead of encoding each ion mobility frame to a different &lt;spectrum&gt;, which leads to millions of spectra per run, it is recommended that each sweep of ion mobility is recorded as a single &lt;spectrum&gt; with an extra ion mobility dimension. In addition to the “m/z array” and “intensity array” (and potentially other arrays) that make up each spectrum, an additional parallel array SHOULD be provided with the most appropriate child term of “ion mobility array” (MS:1002893), depending on the units and degree of processing</w:t>
-      </w:r>
-      <w:r>
-        <w:t>, e.g. “raw inverse reduced ion mobility array” (MS:1003008) or “deconvoluted ion mobility drift time array” (MS:1003156)</w:t>
-      </w:r>
-      <w:r>
-        <w:t xml:space="preserve">. The ambiguous parent term </w:t>
-      </w:r>
-      <w:r>
-        <w:t>“ion mobility array” (</w:t>
-      </w:r>
-      <w:r>
-        <w:t>MS:1002893</w:t>
-      </w:r>
-      <w:r>
-        <w:t>)</w:t>
-      </w:r>
-      <w:r>
-        <w:t xml:space="preserve"> itself MUST NOT be used in a data file.</w:t>
+        <w:t>However, for ion mobility data, instead of encoding each ion mobility frame to a different &lt;spectrum&gt;, which leads to millions of spectra per run, it is recommended that each sweep of ion mobility is recorded as a single &lt;spectrum&gt; with an extra ion mobility dimension. In addition to the “m/z array” and “intensity array” (and potentially other arrays) that make up each spectrum, an additional parallel array SHOULD be provided with the most appropriate child term of “ion mobility array” (MS:1002893), depending on the units and degree of processing, e.g. “raw inverse reduced ion mobility array” (MS:1003008) or “deconvoluted ion mobility drift time array” (MS:1003156). The ambiguous parent term “ion mobility array” (MS:1002893) itself MUST NOT be used in a data file.</w:t>
       </w:r>
     </w:p>
     <w:p>
@@ -3577,7 +3416,7 @@
                 <w:szCs w:val="16"/>
               </w:rPr>
             </w:pPr>
-            <w:hyperlink r:id="rId17" w:history="1">
+            <w:hyperlink r:id="rId18" w:history="1">
               <w:r>
                 <w:rPr>
                   <w:color w:val="1155CC"/>
@@ -3639,7 +3478,7 @@
                 <w:szCs w:val="16"/>
               </w:rPr>
             </w:pPr>
-            <w:hyperlink r:id="rId18" w:history="1">
+            <w:hyperlink r:id="rId19" w:history="1">
               <w:r>
                 <w:rPr>
                   <w:color w:val="1155CC"/>
@@ -3681,9 +3520,6 @@
               <w:t>HDMS</w:t>
             </w:r>
             <w:r>
-              <w:rPr>
-                <w:vertAlign w:val="superscript"/>
-              </w:rPr>
               <w:t>E</w:t>
             </w:r>
           </w:p>
@@ -3707,7 +3543,7 @@
                 <w:szCs w:val="16"/>
               </w:rPr>
             </w:pPr>
-            <w:hyperlink r:id="rId19" w:history="1">
+            <w:hyperlink r:id="rId20" w:history="1">
               <w:r>
                 <w:rPr>
                   <w:color w:val="1155CC"/>
@@ -3750,9 +3586,6 @@
               <w:t>MS</w:t>
             </w:r>
             <w:r>
-              <w:rPr>
-                <w:vertAlign w:val="superscript"/>
-              </w:rPr>
               <w:t>E</w:t>
             </w:r>
           </w:p>
@@ -3776,7 +3609,7 @@
                 <w:szCs w:val="18"/>
               </w:rPr>
             </w:pPr>
-            <w:hyperlink r:id="rId20" w:history="1">
+            <w:hyperlink r:id="rId21" w:history="1">
               <w:r>
                 <w:rPr>
                   <w:color w:val="1155CC"/>
@@ -3838,7 +3671,7 @@
                 <w:szCs w:val="16"/>
               </w:rPr>
             </w:pPr>
-            <w:hyperlink r:id="rId21" w:history="1">
+            <w:hyperlink r:id="rId22" w:history="1">
               <w:r>
                 <w:rPr>
                   <w:color w:val="1155CC"/>
@@ -3901,16 +3734,11 @@
     <w:p>
       <w:pPr>
         <w:pStyle w:val="Heading2"/>
-        <w:numPr>
-          <w:ilvl w:val="1"/>
-          <w:numId w:val="2"/>
-        </w:numPr>
-        <w:jc w:val="both"/>
       </w:pPr>
       <w:bookmarkStart w:id="14" w:name="_35nkun2" w:colFirst="0" w:colLast="0"/>
       <w:bookmarkEnd w:id="14"/>
       <w:r>
-        <w:t xml:space="preserve"> Adjustments for deconvoluted DIA data such as SONAR or HDMSE data</w:t>
+        <w:t>Adjustments for deconvoluted DIA data such as SONAR or HDMSE data</w:t>
       </w:r>
     </w:p>
     <w:p>
@@ -3931,16 +3759,7 @@
       </w:r>
       <w:proofErr w:type="spellEnd"/>
       <w:r>
-        <w:t>, the file content header SHOULD contain one or more of the merged-concept CV terms</w:t>
-      </w:r>
-      <w:r>
-        <w:t xml:space="preserve"> from Table 1 and the term “deconvoluted data” (MS:1003398) </w:t>
-      </w:r>
-      <w:r>
-        <w:t>depending on the appropriate workflow</w:t>
-      </w:r>
-      <w:r>
-        <w:t>. As in section 3.3, the constituent terms should not be used.</w:t>
+        <w:t>, the file content header SHOULD contain one or more of the merged-concept CV terms from Table 1 and the term “deconvoluted data” (MS:1003398) depending on the appropriate workflow. As in section 3.3, the constituent terms should not be used.</w:t>
       </w:r>
     </w:p>
     <w:p/>
@@ -5607,17 +5426,11 @@
       </w:r>
       <w:proofErr w:type="spellEnd"/>
       <w:r>
-        <w:t>&gt; element SHOULD contain the</w:t>
-      </w:r>
-      <w:r>
-        <w:t xml:space="preserve"> marker MS:1003159 “no isolation” </w:t>
+        <w:t xml:space="preserve">&gt; element SHOULD contain the marker MS:1003159 “no isolation” </w:t>
       </w:r>
       <w:proofErr w:type="gramStart"/>
       <w:r>
-        <w:t xml:space="preserve">term  </w:t>
-      </w:r>
-      <w:r>
-        <w:t>:</w:t>
+        <w:t>term  :</w:t>
       </w:r>
       <w:proofErr w:type="gramEnd"/>
     </w:p>
@@ -5777,16 +5590,7 @@
       </w:r>
       <w:proofErr w:type="spellEnd"/>
       <w:r>
-        <w:t>&gt; element is required by the current schema and this requirement is maintained</w:t>
-      </w:r>
-      <w:r>
-        <w:t>, but is valid containing just MS:1003159 marker term, so there is no formal requirement to fill the element with placeholder information</w:t>
-      </w:r>
-      <w:r>
-        <w:t>.</w:t>
-      </w:r>
-      <w:r>
-        <w:t xml:space="preserve"> Compliant readers SHOULD be able to tolerate these terms being absent.</w:t>
+        <w:t>&gt; element is required by the current schema and this requirement is maintained, but is valid containing just MS:1003159 marker term, so there is no formal requirement to fill the element with placeholder information. Compliant readers SHOULD be able to tolerate these terms being absent.</w:t>
       </w:r>
     </w:p>
     <w:p>
@@ -5807,11 +5611,6 @@
     <w:p>
       <w:pPr>
         <w:pStyle w:val="Heading2"/>
-        <w:numPr>
-          <w:ilvl w:val="1"/>
-          <w:numId w:val="2"/>
-        </w:numPr>
-        <w:jc w:val="both"/>
       </w:pPr>
       <w:bookmarkStart w:id="15" w:name="_1ksv4uv" w:colFirst="0" w:colLast="0"/>
       <w:bookmarkEnd w:id="15"/>
@@ -5832,13 +5631,7 @@
         <w:jc w:val="both"/>
       </w:pPr>
       <w:r>
-        <w:t xml:space="preserve">There has been substantial confusion in the community about the best way to differentiate between the low energy and high energy scans from </w:t>
-      </w:r>
-      <w:r>
-        <w:t xml:space="preserve">e.g. </w:t>
-      </w:r>
-      <w:r>
-        <w:t xml:space="preserve">Waters Corporation instruments for MSE, HDMSE, and SONAR acquisitions. Several possible strategies were proposed, but the selected implementation requires no schema change and is as follows. </w:t>
+        <w:t xml:space="preserve">There has been substantial confusion in the community about the best way to differentiate between the low energy and high energy scans from e.g. Waters Corporation instruments for MSE, HDMSE, and SONAR acquisitions. Several possible strategies were proposed, but the selected implementation requires no schema change and is as follows. </w:t>
       </w:r>
     </w:p>
     <w:p>
@@ -5881,11 +5674,6 @@
     <w:p>
       <w:pPr>
         <w:pStyle w:val="Heading2"/>
-        <w:numPr>
-          <w:ilvl w:val="1"/>
-          <w:numId w:val="2"/>
-        </w:numPr>
-        <w:jc w:val="both"/>
       </w:pPr>
       <w:bookmarkStart w:id="16" w:name="_44sinio" w:colFirst="0" w:colLast="0"/>
       <w:bookmarkEnd w:id="16"/>
@@ -6815,13 +6603,7 @@
       </w:r>
       <w:proofErr w:type="spellEnd"/>
       <w:r>
-        <w:t xml:space="preserve"> </w:t>
-      </w:r>
-      <w:r>
-        <w:t xml:space="preserve">differential mobility separation </w:t>
-      </w:r>
-      <w:r>
-        <w:t xml:space="preserve">from SCIEX. For data acquired with the </w:t>
+        <w:t xml:space="preserve"> differential mobility separation from SCIEX. For data acquired with the </w:t>
       </w:r>
       <w:proofErr w:type="spellStart"/>
       <w:r>
@@ -7914,11 +7696,6 @@
     <w:p>
       <w:pPr>
         <w:pStyle w:val="Heading2"/>
-        <w:numPr>
-          <w:ilvl w:val="1"/>
-          <w:numId w:val="2"/>
-        </w:numPr>
-        <w:jc w:val="both"/>
       </w:pPr>
       <w:bookmarkStart w:id="17" w:name="_2jxsxqh" w:colFirst="0" w:colLast="0"/>
       <w:bookmarkEnd w:id="17"/>
@@ -8137,11 +7914,6 @@
     <w:p>
       <w:pPr>
         <w:pStyle w:val="Heading2"/>
-        <w:numPr>
-          <w:ilvl w:val="1"/>
-          <w:numId w:val="2"/>
-        </w:numPr>
-        <w:jc w:val="both"/>
       </w:pPr>
       <w:bookmarkStart w:id="18" w:name="_z337ya" w:colFirst="0" w:colLast="0"/>
       <w:bookmarkEnd w:id="18"/>
@@ -8179,10 +7951,7 @@
       </w:r>
       <w:proofErr w:type="spellEnd"/>
       <w:r>
-        <w:t xml:space="preserve"> compression” and “no compression” were supported compression types.</w:t>
-      </w:r>
-      <w:r>
-        <w:t xml:space="preserve"> The addition of the widely supported MS-</w:t>
+        <w:t xml:space="preserve"> compression” and “no compression” were supported compression types. The addition of the widely supported MS-</w:t>
       </w:r>
       <w:proofErr w:type="spellStart"/>
       <w:r>
@@ -8198,10 +7967,7 @@
       </w:r>
       <w:proofErr w:type="spellEnd"/>
       <w:r>
-        <w:t>:</w:t>
-      </w:r>
-      <w:r>
-        <w:t xml:space="preserve"> </w:t>
+        <w:t xml:space="preserve">: </w:t>
       </w:r>
     </w:p>
     <w:p>
@@ -8657,7 +8423,6 @@
           <w:ilvl w:val="2"/>
           <w:numId w:val="2"/>
         </w:numPr>
-        <w:jc w:val="both"/>
       </w:pPr>
       <w:bookmarkStart w:id="19" w:name="_yx8in5sjn0j2" w:colFirst="0" w:colLast="0"/>
       <w:bookmarkEnd w:id="19"/>
@@ -8705,7 +8470,7 @@
                     <pic:cNvPicPr preferRelativeResize="0"/>
                   </pic:nvPicPr>
                   <pic:blipFill>
-                    <a:blip r:embed="rId22"/>
+                    <a:blip r:embed="rId23"/>
                     <a:srcRect/>
                     <a:stretch>
                       <a:fillRect/>
@@ -8756,7 +8521,7 @@
                     <pic:cNvPicPr preferRelativeResize="0"/>
                   </pic:nvPicPr>
                   <pic:blipFill>
-                    <a:blip r:embed="rId23"/>
+                    <a:blip r:embed="rId24"/>
                     <a:srcRect/>
                     <a:stretch>
                       <a:fillRect/>
@@ -9564,7 +9329,6 @@
           <w:ilvl w:val="2"/>
           <w:numId w:val="2"/>
         </w:numPr>
-        <w:jc w:val="both"/>
       </w:pPr>
       <w:bookmarkStart w:id="20" w:name="_nm61v34giw1r" w:colFirst="0" w:colLast="0"/>
       <w:bookmarkEnd w:id="20"/>
@@ -9618,8 +9382,16 @@
           <w:ilvl w:val="3"/>
           <w:numId w:val="2"/>
         </w:numPr>
-      </w:pPr>
-      <w:r>
+        <w:rPr>
+          <w:b/>
+          <w:bCs/>
+        </w:rPr>
+      </w:pPr>
+      <w:r>
+        <w:rPr>
+          <w:b/>
+          <w:bCs/>
+        </w:rPr>
         <w:t>Encoding</w:t>
       </w:r>
     </w:p>
@@ -9649,7 +9421,7 @@
                     <pic:cNvPicPr preferRelativeResize="0"/>
                   </pic:nvPicPr>
                   <pic:blipFill>
-                    <a:blip r:embed="rId24"/>
+                    <a:blip r:embed="rId25"/>
                     <a:srcRect/>
                     <a:stretch>
                       <a:fillRect/>
@@ -9692,7 +9464,7 @@
                     <pic:cNvPicPr preferRelativeResize="0"/>
                   </pic:nvPicPr>
                   <pic:blipFill>
-                    <a:blip r:embed="rId25"/>
+                    <a:blip r:embed="rId26"/>
                     <a:srcRect/>
                     <a:stretch>
                       <a:fillRect/>
@@ -9735,7 +9507,7 @@
                     <pic:cNvPicPr preferRelativeResize="0"/>
                   </pic:nvPicPr>
                   <pic:blipFill>
-                    <a:blip r:embed="rId25"/>
+                    <a:blip r:embed="rId26"/>
                     <a:srcRect/>
                     <a:stretch>
                       <a:fillRect/>
@@ -9778,7 +9550,7 @@
                     <pic:cNvPicPr preferRelativeResize="0"/>
                   </pic:nvPicPr>
                   <pic:blipFill>
-                    <a:blip r:embed="rId25"/>
+                    <a:blip r:embed="rId26"/>
                     <a:srcRect/>
                     <a:stretch>
                       <a:fillRect/>
@@ -9821,7 +9593,7 @@
                     <pic:cNvPicPr preferRelativeResize="0"/>
                   </pic:nvPicPr>
                   <pic:blipFill>
-                    <a:blip r:embed="rId26"/>
+                    <a:blip r:embed="rId27"/>
                     <a:srcRect/>
                     <a:stretch>
                       <a:fillRect/>
@@ -9864,7 +9636,7 @@
                     <pic:cNvPicPr preferRelativeResize="0"/>
                   </pic:nvPicPr>
                   <pic:blipFill>
-                    <a:blip r:embed="rId27"/>
+                    <a:blip r:embed="rId28"/>
                     <a:srcRect/>
                     <a:stretch>
                       <a:fillRect/>
@@ -9936,7 +9708,7 @@
                     <pic:cNvPicPr preferRelativeResize="0"/>
                   </pic:nvPicPr>
                   <pic:blipFill>
-                    <a:blip r:embed="rId28"/>
+                    <a:blip r:embed="rId29"/>
                     <a:srcRect/>
                     <a:stretch>
                       <a:fillRect/>
@@ -9992,7 +9764,7 @@
                     <pic:cNvPicPr preferRelativeResize="0"/>
                   </pic:nvPicPr>
                   <pic:blipFill>
-                    <a:blip r:embed="rId29"/>
+                    <a:blip r:embed="rId30"/>
                     <a:srcRect/>
                     <a:stretch>
                       <a:fillRect/>
@@ -10035,7 +9807,7 @@
                     <pic:cNvPicPr preferRelativeResize="0"/>
                   </pic:nvPicPr>
                   <pic:blipFill>
-                    <a:blip r:embed="rId30"/>
+                    <a:blip r:embed="rId31"/>
                     <a:srcRect/>
                     <a:stretch>
                       <a:fillRect/>
@@ -10078,7 +9850,7 @@
                     <pic:cNvPicPr preferRelativeResize="0"/>
                   </pic:nvPicPr>
                   <pic:blipFill>
-                    <a:blip r:embed="rId31"/>
+                    <a:blip r:embed="rId32"/>
                     <a:srcRect/>
                     <a:stretch>
                       <a:fillRect/>
@@ -10121,7 +9893,7 @@
                     <pic:cNvPicPr preferRelativeResize="0"/>
                   </pic:nvPicPr>
                   <pic:blipFill>
-                    <a:blip r:embed="rId31"/>
+                    <a:blip r:embed="rId32"/>
                     <a:srcRect/>
                     <a:stretch>
                       <a:fillRect/>
@@ -10164,7 +9936,7 @@
                     <pic:cNvPicPr preferRelativeResize="0"/>
                   </pic:nvPicPr>
                   <pic:blipFill>
-                    <a:blip r:embed="rId29"/>
+                    <a:blip r:embed="rId30"/>
                     <a:srcRect/>
                     <a:stretch>
                       <a:fillRect/>
@@ -10201,8 +9973,16 @@
           <w:ilvl w:val="3"/>
           <w:numId w:val="2"/>
         </w:numPr>
-      </w:pPr>
-      <w:r>
+        <w:rPr>
+          <w:b/>
+          <w:bCs/>
+        </w:rPr>
+      </w:pPr>
+      <w:r>
+        <w:rPr>
+          <w:b/>
+          <w:bCs/>
+        </w:rPr>
         <w:t>Decoding</w:t>
       </w:r>
     </w:p>
@@ -10240,7 +10020,7 @@
                     <pic:cNvPicPr preferRelativeResize="0"/>
                   </pic:nvPicPr>
                   <pic:blipFill>
-                    <a:blip r:embed="rId32"/>
+                    <a:blip r:embed="rId33"/>
                     <a:srcRect/>
                     <a:stretch>
                       <a:fillRect/>
@@ -10283,7 +10063,7 @@
                     <pic:cNvPicPr preferRelativeResize="0"/>
                   </pic:nvPicPr>
                   <pic:blipFill>
-                    <a:blip r:embed="rId33"/>
+                    <a:blip r:embed="rId34"/>
                     <a:srcRect/>
                     <a:stretch>
                       <a:fillRect/>
@@ -10326,7 +10106,7 @@
                     <pic:cNvPicPr preferRelativeResize="0"/>
                   </pic:nvPicPr>
                   <pic:blipFill>
-                    <a:blip r:embed="rId25"/>
+                    <a:blip r:embed="rId26"/>
                     <a:srcRect/>
                     <a:stretch>
                       <a:fillRect/>
@@ -10369,7 +10149,7 @@
                     <pic:cNvPicPr preferRelativeResize="0"/>
                   </pic:nvPicPr>
                   <pic:blipFill>
-                    <a:blip r:embed="rId34"/>
+                    <a:blip r:embed="rId35"/>
                     <a:srcRect/>
                     <a:stretch>
                       <a:fillRect/>
@@ -10412,7 +10192,7 @@
                     <pic:cNvPicPr preferRelativeResize="0"/>
                   </pic:nvPicPr>
                   <pic:blipFill>
-                    <a:blip r:embed="rId25"/>
+                    <a:blip r:embed="rId26"/>
                     <a:srcRect/>
                     <a:stretch>
                       <a:fillRect/>
@@ -10455,7 +10235,7 @@
                     <pic:cNvPicPr preferRelativeResize="0"/>
                   </pic:nvPicPr>
                   <pic:blipFill>
-                    <a:blip r:embed="rId35"/>
+                    <a:blip r:embed="rId36"/>
                     <a:srcRect/>
                     <a:stretch>
                       <a:fillRect/>
@@ -10498,7 +10278,7 @@
                     <pic:cNvPicPr preferRelativeResize="0"/>
                   </pic:nvPicPr>
                   <pic:blipFill>
-                    <a:blip r:embed="rId25"/>
+                    <a:blip r:embed="rId26"/>
                     <a:srcRect/>
                     <a:stretch>
                       <a:fillRect/>
@@ -10541,7 +10321,7 @@
                     <pic:cNvPicPr preferRelativeResize="0"/>
                   </pic:nvPicPr>
                   <pic:blipFill>
-                    <a:blip r:embed="rId25"/>
+                    <a:blip r:embed="rId26"/>
                     <a:srcRect/>
                     <a:stretch>
                       <a:fillRect/>
@@ -10584,7 +10364,7 @@
                     <pic:cNvPicPr preferRelativeResize="0"/>
                   </pic:nvPicPr>
                   <pic:blipFill>
-                    <a:blip r:embed="rId26"/>
+                    <a:blip r:embed="rId27"/>
                     <a:srcRect/>
                     <a:stretch>
                       <a:fillRect/>
@@ -10627,7 +10407,7 @@
                     <pic:cNvPicPr preferRelativeResize="0"/>
                   </pic:nvPicPr>
                   <pic:blipFill>
-                    <a:blip r:embed="rId34"/>
+                    <a:blip r:embed="rId35"/>
                     <a:srcRect/>
                     <a:stretch>
                       <a:fillRect/>
@@ -10670,7 +10450,7 @@
                     <pic:cNvPicPr preferRelativeResize="0"/>
                   </pic:nvPicPr>
                   <pic:blipFill>
-                    <a:blip r:embed="rId24"/>
+                    <a:blip r:embed="rId25"/>
                     <a:srcRect/>
                     <a:stretch>
                       <a:fillRect/>
@@ -10713,7 +10493,7 @@
                     <pic:cNvPicPr preferRelativeResize="0"/>
                   </pic:nvPicPr>
                   <pic:blipFill>
-                    <a:blip r:embed="rId36"/>
+                    <a:blip r:embed="rId37"/>
                     <a:srcRect/>
                     <a:stretch>
                       <a:fillRect/>
@@ -15350,8 +15130,16 @@
           <w:ilvl w:val="3"/>
           <w:numId w:val="2"/>
         </w:numPr>
-      </w:pPr>
-      <w:r>
+        <w:rPr>
+          <w:b/>
+          <w:bCs/>
+        </w:rPr>
+      </w:pPr>
+      <w:r>
+        <w:rPr>
+          <w:b/>
+          <w:bCs/>
+        </w:rPr>
         <w:t>Combining dictionaries and byte shuffling</w:t>
       </w:r>
     </w:p>
@@ -15381,7 +15169,7 @@
                     <pic:cNvPicPr preferRelativeResize="0"/>
                   </pic:nvPicPr>
                   <pic:blipFill>
-                    <a:blip r:embed="rId25"/>
+                    <a:blip r:embed="rId26"/>
                     <a:srcRect/>
                     <a:stretch>
                       <a:fillRect/>
@@ -15424,7 +15212,7 @@
                     <pic:cNvPicPr preferRelativeResize="0"/>
                   </pic:nvPicPr>
                   <pic:blipFill>
-                    <a:blip r:embed="rId33"/>
+                    <a:blip r:embed="rId34"/>
                     <a:srcRect/>
                     <a:stretch>
                       <a:fillRect/>
@@ -15490,7 +15278,7 @@
                     <pic:cNvPicPr preferRelativeResize="0"/>
                   </pic:nvPicPr>
                   <pic:blipFill>
-                    <a:blip r:embed="rId37"/>
+                    <a:blip r:embed="rId38"/>
                     <a:srcRect/>
                     <a:stretch>
                       <a:fillRect/>
@@ -19808,13 +19596,7 @@
         <w:jc w:val="both"/>
       </w:pPr>
       <w:r>
-        <w:t>Copyright (C) Proteomics Standards Initiative (202</w:t>
-      </w:r>
-      <w:r>
-        <w:t>6</w:t>
-      </w:r>
-      <w:r>
-        <w:t>). All Rights Reserved.</w:t>
+        <w:t>Copyright (C) Proteomics Standards Initiative (2026). All Rights Reserved.</w:t>
       </w:r>
     </w:p>
     <w:p>
@@ -19928,7 +19710,7 @@
           <w:color w:val="000000"/>
         </w:rPr>
       </w:pPr>
-      <w:hyperlink r:id="rId38">
+      <w:hyperlink r:id="rId39">
         <w:proofErr w:type="spellStart"/>
         <w:r>
           <w:rPr>
@@ -19986,7 +19768,7 @@
           <w:t xml:space="preserve"> and Optimized for Speed and Storage Requirements.” </w:t>
         </w:r>
       </w:hyperlink>
-      <w:hyperlink r:id="rId39">
+      <w:hyperlink r:id="rId40">
         <w:r>
           <w:rPr>
             <w:i/>
@@ -19996,7 +19778,7 @@
           <w:t>Journal of Proteome Research</w:t>
         </w:r>
       </w:hyperlink>
-      <w:hyperlink r:id="rId40">
+      <w:hyperlink r:id="rId41">
         <w:r>
           <w:rPr>
             <w:color w:val="000000"/>
@@ -20013,7 +19795,7 @@
           <w:color w:val="000000"/>
         </w:rPr>
       </w:pPr>
-      <w:hyperlink r:id="rId41">
+      <w:hyperlink r:id="rId42">
         <w:r>
           <w:rPr>
             <w:color w:val="000000"/>
@@ -20021,7 +19803,7 @@
           <w:t>Bradner, S. 1997. “Key Words for Use in RFCs to Indicate Requirement Levels.” RFC Editor. https://doi.org/</w:t>
         </w:r>
       </w:hyperlink>
-      <w:hyperlink r:id="rId42">
+      <w:hyperlink r:id="rId43">
         <w:r>
           <w:rPr>
             <w:color w:val="000000"/>
@@ -20029,7 +19811,7 @@
           <w:t>10.17487/rfc2119</w:t>
         </w:r>
       </w:hyperlink>
-      <w:hyperlink r:id="rId43">
+      <w:hyperlink r:id="rId44">
         <w:r>
           <w:rPr>
             <w:color w:val="000000"/>
@@ -20046,7 +19828,7 @@
           <w:color w:val="000000"/>
         </w:rPr>
       </w:pPr>
-      <w:hyperlink r:id="rId44">
+      <w:hyperlink r:id="rId45">
         <w:r>
           <w:rPr>
             <w:color w:val="000000"/>
@@ -20082,7 +19864,7 @@
           <w:t xml:space="preserve">--a Community Standard for Mass Spectrometry Data.” </w:t>
         </w:r>
       </w:hyperlink>
-      <w:hyperlink r:id="rId45">
+      <w:hyperlink r:id="rId46">
         <w:r>
           <w:rPr>
             <w:i/>
@@ -20092,7 +19874,7 @@
           <w:t>Molecular &amp; Cellular Proteomics: MCP</w:t>
         </w:r>
       </w:hyperlink>
-      <w:hyperlink r:id="rId46">
+      <w:hyperlink r:id="rId47">
         <w:r>
           <w:rPr>
             <w:color w:val="000000"/>
@@ -20109,7 +19891,7 @@
           <w:color w:val="000000"/>
         </w:rPr>
       </w:pPr>
-      <w:hyperlink r:id="rId47">
+      <w:hyperlink r:id="rId48">
         <w:r>
           <w:rPr>
             <w:color w:val="000000"/>
@@ -20131,7 +19913,7 @@
           <w:t xml:space="preserve">, Andrew R. Jones, Pierre-Alain Binz, Eric W. Deutsch, Matthew Chambers, et al. 2013. “The HUPO Proteomics Standards Initiative- Mass Spectrometry Controlled Vocabulary.” </w:t>
         </w:r>
       </w:hyperlink>
-      <w:hyperlink r:id="rId48">
+      <w:hyperlink r:id="rId49">
         <w:r>
           <w:rPr>
             <w:i/>
@@ -20141,7 +19923,7 @@
           <w:t>Database: The Journal of Biological Databases and Curation</w:t>
         </w:r>
       </w:hyperlink>
-      <w:hyperlink r:id="rId49">
+      <w:hyperlink r:id="rId50">
         <w:r>
           <w:rPr>
             <w:color w:val="000000"/>
@@ -20158,7 +19940,7 @@
           <w:color w:val="000000"/>
         </w:rPr>
       </w:pPr>
-      <w:hyperlink r:id="rId50">
+      <w:hyperlink r:id="rId51">
         <w:r>
           <w:rPr>
             <w:color w:val="000000"/>
@@ -20166,7 +19948,7 @@
           <w:t xml:space="preserve">Meier, Florian, Andreas-David Brunner, Max Frank, Annie Ha, Isabell Bludau, Eugenia Voytik, Stephanie Kaspar-Schoenefeld, et al. 2019. “Parallel Accumulation – Serial Fragmentation Combined with Data-Independent Acquisition (diaPASEF): Bottom-up Proteomics with near Optimal Ion Usage.” </w:t>
         </w:r>
       </w:hyperlink>
-      <w:hyperlink r:id="rId51">
+      <w:hyperlink r:id="rId52">
         <w:r>
           <w:rPr>
             <w:i/>
@@ -20176,7 +19958,7 @@
           <w:t>bioRxiv</w:t>
         </w:r>
       </w:hyperlink>
-      <w:hyperlink r:id="rId52">
+      <w:hyperlink r:id="rId53">
         <w:r>
           <w:rPr>
             <w:color w:val="000000"/>
@@ -20184,7 +19966,7 @@
           <w:t>. bioRxiv. https://doi.org/</w:t>
         </w:r>
       </w:hyperlink>
-      <w:hyperlink r:id="rId53">
+      <w:hyperlink r:id="rId54">
         <w:r>
           <w:rPr>
             <w:color w:val="000000"/>
@@ -20192,7 +19974,7 @@
           <w:t>10.1101/656207</w:t>
         </w:r>
       </w:hyperlink>
-      <w:hyperlink r:id="rId54">
+      <w:hyperlink r:id="rId55">
         <w:r>
           <w:rPr>
             <w:color w:val="000000"/>
@@ -20209,7 +19991,7 @@
           <w:color w:val="000000"/>
         </w:rPr>
       </w:pPr>
-      <w:hyperlink r:id="rId55">
+      <w:hyperlink r:id="rId56">
         <w:r>
           <w:rPr>
             <w:color w:val="000000"/>
@@ -20231,7 +20013,7 @@
           <w:t xml:space="preserve">, Erik J. Soderblom, Sarah Lennon, Simon R. Perkins, J. Will Thompson, et al. 2018. “Scanning Quadrupole Data-Independent Acquisition, Part A: Qualitative and Quantitative Characterization.” </w:t>
         </w:r>
       </w:hyperlink>
-      <w:hyperlink r:id="rId56">
+      <w:hyperlink r:id="rId57">
         <w:r>
           <w:rPr>
             <w:i/>
@@ -20241,7 +20023,7 @@
           <w:t>Journal of Proteome Research</w:t>
         </w:r>
       </w:hyperlink>
-      <w:hyperlink r:id="rId57">
+      <w:hyperlink r:id="rId58">
         <w:r>
           <w:rPr>
             <w:color w:val="000000"/>
@@ -20259,7 +20041,7 @@
           <w:color w:val="000000"/>
         </w:rPr>
       </w:pPr>
-      <w:hyperlink r:id="rId58">
+      <w:hyperlink r:id="rId59">
         <w:r>
           <w:rPr>
             <w:color w:val="000000"/>
@@ -20267,7 +20049,7 @@
           <w:t xml:space="preserve">Rodriguez-Suarez, Eva, Chris Hughes, Lee Gethings, Kevin Giles, Jason Wildgoose, Martha Stapels, Keith E. Fadgen, et al. 2013. “An Ion Mobility Assisted Data Independent LC-MS Strategy for the Analysis of Complex Biological Samples.” </w:t>
         </w:r>
       </w:hyperlink>
-      <w:hyperlink r:id="rId59">
+      <w:hyperlink r:id="rId60">
         <w:r>
           <w:rPr>
             <w:i/>
@@ -20277,7 +20059,7 @@
           <w:t>Current Analytical Chemistry</w:t>
         </w:r>
       </w:hyperlink>
-      <w:hyperlink r:id="rId60">
+      <w:hyperlink r:id="rId61">
         <w:r>
           <w:rPr>
             <w:color w:val="000000"/>
@@ -20293,8 +20075,8 @@
       </w:pPr>
     </w:p>
     <w:sectPr>
-      <w:headerReference w:type="default" r:id="rId61"/>
-      <w:footerReference w:type="default" r:id="rId62"/>
+      <w:headerReference w:type="default" r:id="rId62"/>
+      <w:footerReference w:type="default" r:id="rId63"/>
       <w:pgSz w:w="11906" w:h="16838"/>
       <w:pgMar w:top="1440" w:right="1440" w:bottom="1440" w:left="1440" w:header="720" w:footer="720" w:gutter="0"/>
       <w:pgNumType w:start="1"/>
@@ -20473,10 +20255,7 @@
       <w:t>7</w:t>
     </w:r>
     <w:r>
-      <w:t>, 202</w:t>
-    </w:r>
-    <w:r>
-      <w:t>6</w:t>
+      <w:t>, 2026</w:t>
     </w:r>
   </w:p>
 </w:hdr>
@@ -20600,7 +20379,7 @@
   <w:abstractNum w:abstractNumId="1" w15:restartNumberingAfterBreak="0">
     <w:nsid w:val="1DE51054"/>
     <w:multiLevelType w:val="multilevel"/>
-    <w:tmpl w:val="42B23D26"/>
+    <w:tmpl w:val="9AFACD62"/>
     <w:lvl w:ilvl="0">
       <w:start w:val="1"/>
       <w:numFmt w:val="decimal"/>
@@ -20613,6 +20392,7 @@
     <w:lvl w:ilvl="1">
       <w:start w:val="1"/>
       <w:numFmt w:val="decimal"/>
+      <w:pStyle w:val="Heading2"/>
       <w:lvlText w:val="%1.%2"/>
       <w:lvlJc w:val="left"/>
       <w:pPr>
@@ -21225,11 +21005,19 @@
     <w:uiPriority w:val="9"/>
     <w:unhideWhenUsed/>
     <w:qFormat/>
+    <w:rsid w:val="00301D17"/>
     <w:pPr>
       <w:keepNext/>
-      <w:ind w:left="1800" w:hanging="360"/>
+      <w:numPr>
+        <w:ilvl w:val="1"/>
+        <w:numId w:val="2"/>
+      </w:numPr>
+      <w:jc w:val="both"/>
       <w:outlineLvl w:val="1"/>
     </w:pPr>
+    <w:rPr>
+      <w:b/>
+    </w:rPr>
   </w:style>
   <w:style w:type="paragraph" w:styleId="Heading3">
     <w:name w:val="heading 3"/>
@@ -21316,6 +21104,7 @@
   <w:style w:type="character" w:default="1" w:styleId="DefaultParagraphFont">
     <w:name w:val="Default Paragraph Font"/>
     <w:uiPriority w:val="1"/>
+    <w:semiHidden/>
     <w:unhideWhenUsed/>
   </w:style>
   <w:style w:type="table" w:default="1" w:styleId="TableNormal">
@@ -21826,4 +21615,16 @@
   </a:objectDefaults>
   <a:extraClrSchemeLst/>
 </a:theme>
+</file>
+
+<file path=customXml/item1.xml><?xml version="1.0" encoding="utf-8"?>
+<b:Sources xmlns:b="http://schemas.openxmlformats.org/officeDocument/2006/bibliography" xmlns="http://schemas.openxmlformats.org/officeDocument/2006/bibliography" SelectedStyle="\APASixthEditionOfficeOnline.xsl" StyleName="APA" Version="6"/>
+</file>
+
+<file path=customXml/itemProps1.xml><?xml version="1.0" encoding="utf-8"?>
+<ds:datastoreItem xmlns:ds="http://schemas.openxmlformats.org/officeDocument/2006/customXml" ds:itemID="{3F66EE0E-AF12-4789-8E28-BA85ED3C7808}">
+  <ds:schemaRefs>
+    <ds:schemaRef ds:uri="http://schemas.openxmlformats.org/officeDocument/2006/bibliography"/>
+  </ds:schemaRefs>
+</ds:datastoreItem>
 </file>
</xml_diff>